<commit_message>
estructura y nuevos datos
</commit_message>
<xml_diff>
--- a/Informe_ETL_DataWarehouse.docx
+++ b/Informe_ETL_DataWarehouse.docx
@@ -496,7 +496,351 @@
         <w:pStyle w:val="Heading2"/>
       </w:pPr>
       <w:r>
-        <w:t>1.2. Definición del esquema (SQL)</w:t>
+        <w:t>1.2. Tipo de conexión a las fuentes de extracción</w:t>
+      </w:r>
+    </w:p>
+    <w:tbl>
+      <w:tblPr>
+        <w:tblStyle w:val="TableGrid"/>
+        <w:tblW w:type="auto" w:w="0"/>
+        <w:jc w:val="center"/>
+        <w:tblLook w:firstColumn="1" w:firstRow="1" w:lastColumn="0" w:lastRow="0" w:noHBand="0" w:noVBand="1" w:val="04A0"/>
+      </w:tblPr>
+      <w:tblGrid>
+        <w:gridCol w:w="2880"/>
+        <w:gridCol w:w="2880"/>
+        <w:gridCol w:w="2880"/>
+      </w:tblGrid>
+      <w:tr>
+        <w:tc>
+          <w:tcPr>
+            <w:tcW w:type="dxa" w:w="2880"/>
+          </w:tcPr>
+          <w:p>
+            <w:pPr>
+              <w:jc w:val="center"/>
+            </w:pPr>
+            <w:r>
+              <w:rPr>
+                <w:b/>
+                <w:sz w:val="20"/>
+              </w:rPr>
+              <w:t>Fuente</w:t>
+            </w:r>
+          </w:p>
+        </w:tc>
+        <w:tc>
+          <w:tcPr>
+            <w:tcW w:type="dxa" w:w="2880"/>
+          </w:tcPr>
+          <w:p>
+            <w:pPr>
+              <w:jc w:val="center"/>
+            </w:pPr>
+            <w:r>
+              <w:rPr>
+                <w:b/>
+                <w:sz w:val="20"/>
+              </w:rPr>
+              <w:t>Tipo de conexión</w:t>
+            </w:r>
+          </w:p>
+        </w:tc>
+        <w:tc>
+          <w:tcPr>
+            <w:tcW w:type="dxa" w:w="2880"/>
+          </w:tcPr>
+          <w:p>
+            <w:pPr>
+              <w:jc w:val="center"/>
+            </w:pPr>
+            <w:r>
+              <w:rPr>
+                <w:b/>
+                <w:sz w:val="20"/>
+              </w:rPr>
+              <w:t>Método</w:t>
+            </w:r>
+          </w:p>
+        </w:tc>
+      </w:tr>
+      <w:tr>
+        <w:tc>
+          <w:tcPr>
+            <w:tcW w:type="dxa" w:w="2880"/>
+          </w:tcPr>
+          <w:p>
+            <w:r>
+              <w:rPr>
+                <w:sz w:val="20"/>
+              </w:rPr>
+              <w:t>Grupo 3 (propio)</w:t>
+            </w:r>
+          </w:p>
+        </w:tc>
+        <w:tc>
+          <w:tcPr>
+            <w:tcW w:type="dxa" w:w="2880"/>
+          </w:tcPr>
+          <w:p>
+            <w:r>
+              <w:rPr>
+                <w:sz w:val="20"/>
+              </w:rPr>
+              <w:t>Directa (localhost)</w:t>
+            </w:r>
+          </w:p>
+        </w:tc>
+        <w:tc>
+          <w:tcPr>
+            <w:tcW w:type="dxa" w:w="2880"/>
+          </w:tcPr>
+          <w:p>
+            <w:r>
+              <w:rPr>
+                <w:sz w:val="20"/>
+              </w:rPr>
+              <w:t>Consulta SQL local al contenedor Docker (puerto 5432)</w:t>
+            </w:r>
+          </w:p>
+        </w:tc>
+      </w:tr>
+      <w:tr>
+        <w:tc>
+          <w:tcPr>
+            <w:tcW w:type="dxa" w:w="2880"/>
+          </w:tcPr>
+          <w:p>
+            <w:r>
+              <w:rPr>
+                <w:sz w:val="20"/>
+              </w:rPr>
+              <w:t>Grupo 1</w:t>
+            </w:r>
+          </w:p>
+        </w:tc>
+        <w:tc>
+          <w:tcPr>
+            <w:tcW w:type="dxa" w:w="2880"/>
+          </w:tcPr>
+          <w:p>
+            <w:r>
+              <w:rPr>
+                <w:sz w:val="20"/>
+              </w:rPr>
+              <w:t>Descarga CSV</w:t>
+            </w:r>
+          </w:p>
+        </w:tc>
+        <w:tc>
+          <w:tcPr>
+            <w:tcW w:type="dxa" w:w="2880"/>
+          </w:tcPr>
+          <w:p>
+            <w:r>
+              <w:rPr>
+                <w:sz w:val="20"/>
+              </w:rPr>
+              <w:t>Conexión psql a Supabase → \copy TO STDOUT → CSV → importación staging</w:t>
+            </w:r>
+          </w:p>
+        </w:tc>
+      </w:tr>
+      <w:tr>
+        <w:tc>
+          <w:tcPr>
+            <w:tcW w:type="dxa" w:w="2880"/>
+          </w:tcPr>
+          <w:p>
+            <w:r>
+              <w:rPr>
+                <w:sz w:val="20"/>
+              </w:rPr>
+              <w:t>Grupo 6</w:t>
+            </w:r>
+          </w:p>
+        </w:tc>
+        <w:tc>
+          <w:tcPr>
+            <w:tcW w:type="dxa" w:w="2880"/>
+          </w:tcPr>
+          <w:p>
+            <w:r>
+              <w:rPr>
+                <w:sz w:val="20"/>
+              </w:rPr>
+              <w:t>Backup (dump SQL)</w:t>
+            </w:r>
+          </w:p>
+        </w:tc>
+        <w:tc>
+          <w:tcPr>
+            <w:tcW w:type="dxa" w:w="2880"/>
+          </w:tcPr>
+          <w:p>
+            <w:r>
+              <w:rPr>
+                <w:sz w:val="20"/>
+              </w:rPr>
+              <w:t>Archivo dump PostgreSQL → conversión encoding → carga staging</w:t>
+            </w:r>
+          </w:p>
+        </w:tc>
+      </w:tr>
+    </w:tbl>
+    <w:p>
+      <w:pPr>
+        <w:pStyle w:val="Heading3"/>
+      </w:pPr>
+      <w:r>
+        <w:t>1.2.1. Proceso de extracción: Grupo 3 (Directa)</w:t>
+      </w:r>
+    </w:p>
+    <w:p>
+      <w:r>
+        <w:t>Los datos del Grupo 3 residen en la misma base de datos destino (clinica_db). La carga al DW se realiza mediante consultas COPY directas:</w:t>
+      </w:r>
+    </w:p>
+    <w:p>
+      <w:pPr>
+        <w:spacing w:before="80" w:after="80"/>
+        <w:ind w:left="360"/>
+      </w:pPr>
+      <w:r>
+        <w:rPr>
+          <w:rFonts w:ascii="Consolas" w:hAnsi="Consolas"/>
+          <w:sz w:val="17"/>
+        </w:rPr>
+        <w:t>-- Extracción directa desde el contenedor 'db'</w:t>
+        <w:br/>
+        <w:t>docker compose exec -T db psql -U clinica_user -d clinica_db -c "</w:t>
+        <w:br/>
+        <w:t xml:space="preserve">    COPY (</w:t>
+        <w:br/>
+        <w:t xml:space="preserve">        SELECT p.CI, p.Nombre, p.Fecha_Nacimiento, ...</w:t>
+        <w:br/>
+        <w:t xml:space="preserve">        FROM PERSONA p</w:t>
+        <w:br/>
+        <w:t xml:space="preserve">        JOIN ZONA z ON z.ID_Zona = p.ID_Zona</w:t>
+        <w:br/>
+        <w:t xml:space="preserve">        WHERE p.Matricula IS NULL</w:t>
+        <w:br/>
+        <w:t xml:space="preserve">    ) TO STDOUT WITH (FORMAT csv)</w:t>
+        <w:br/>
+        <w:t>" &gt; /tmp/dw_dim_paciente.csv</w:t>
+      </w:r>
+    </w:p>
+    <w:p>
+      <w:pPr>
+        <w:pStyle w:val="Heading3"/>
+      </w:pPr>
+      <w:r>
+        <w:t>1.2.2. Proceso de extracción: Grupo 1 (Descarga CSV)</w:t>
+      </w:r>
+    </w:p>
+    <w:p>
+      <w:r>
+        <w:t>Se conecta al servidor Supabase del Grupo 1 usando psql con cadena de conexión PostgreSQL. Se descargan 4 tablas a archivos CSV locales mediante \copy TO STDOUT, que luego se importan a tablas staging en nuestra base de datos:</w:t>
+      </w:r>
+    </w:p>
+    <w:p>
+      <w:pPr>
+        <w:spacing w:before="80" w:after="80"/>
+        <w:ind w:left="360"/>
+      </w:pPr>
+      <w:r>
+        <w:rPr>
+          <w:rFonts w:ascii="Consolas" w:hAnsi="Consolas"/>
+          <w:sz w:val="17"/>
+        </w:rPr>
+        <w:t># Cadena de conexión al servidor remoto (Supabase)</w:t>
+        <w:br/>
+        <w:t>G1_CONN="postgresql://usuario1.&lt;host&gt;:&lt;pass&gt;@&lt;ip&gt;:5432/postgres?sslmode=require"</w:t>
+        <w:br/>
+        <w:br/>
+        <w:t># Exportar cada tabla a CSV via consulta remota</w:t>
+        <w:br/>
+        <w:t>docker compose exec -T db psql "$G1_CONN" -c "</w:t>
+        <w:br/>
+        <w:t xml:space="preserve">    \copy (SELECT paciente_id, nombre, fecha_nacimiento, genero</w:t>
+        <w:br/>
+        <w:t xml:space="preserve">           FROM pacientes ORDER BY paciente_id)</w:t>
+        <w:br/>
+        <w:t xml:space="preserve">    TO STDOUT WITH (FORMAT csv, HEADER true)</w:t>
+        <w:br/>
+        <w:t>" &gt; /tmp/etl_g1_csv/g1_pacientes.csv</w:t>
+        <w:br/>
+        <w:br/>
+        <w:t># Se repite para: personal, atenciones, diagnosticos</w:t>
+        <w:br/>
+        <w:br/>
+        <w:t># Copiar CSVs al contenedor e importar a tablas staging</w:t>
+        <w:br/>
+        <w:t>docker cp g1_pacientes.csv &lt;contenedor&gt;:/tmp/g1_pacientes.csv</w:t>
+        <w:br/>
+        <w:t>docker compose exec -T db psql -U clinica_user -d clinica_db \</w:t>
+        <w:br/>
+        <w:t xml:space="preserve">    &lt; etl/grupo1/01-extract.sql  -- CREATE TABLE stg_g1_* + \copy FROM</w:t>
+      </w:r>
+    </w:p>
+    <w:p>
+      <w:pPr>
+        <w:pStyle w:val="Heading3"/>
+      </w:pPr>
+      <w:r>
+        <w:t>1.2.3. Proceso de extracción: Grupo 6 (Backup SQL)</w:t>
+      </w:r>
+    </w:p>
+    <w:p>
+      <w:r>
+        <w:t>El Grupo 6 entrega sus datos como dump SQL (PostgreSQL 17, encoding WIN1252). El proceso de carga sigue estos pasos:</w:t>
+      </w:r>
+    </w:p>
+    <w:p>
+      <w:pPr>
+        <w:spacing w:before="80" w:after="80"/>
+        <w:ind w:left="360"/>
+      </w:pPr>
+      <w:r>
+        <w:rPr>
+          <w:rFonts w:ascii="Consolas" w:hAnsi="Consolas"/>
+          <w:sz w:val="17"/>
+        </w:rPr>
+        <w:t># 1. Crear tablas staging que replican el esquema G6</w:t>
+        <w:br/>
+        <w:t>docker compose exec -T db psql -U clinica_user -d clinica_db \</w:t>
+        <w:br/>
+        <w:t xml:space="preserve">    &lt; etl/grupo6_v2/01-extract.sql</w:t>
+        <w:br/>
+        <w:t xml:space="preserve">    -- Crea: stg_g6_persona, stg_g6_paciente, stg_g6_personal,</w:t>
+        <w:br/>
+        <w:t xml:space="preserve">    --       stg_g6_cita_medica, stg_g6_diagnostico, stg_g6_receta, ...</w:t>
+        <w:br/>
+        <w:br/>
+        <w:t># 2. Conversión de encoding y renombrado de tablas</w:t>
+        <w:br/>
+        <w:t>iconv -f WINDOWS-1252 -t UTF-8 hospital_db_inserts.sql | \</w:t>
+        <w:br/>
+        <w:t xml:space="preserve">    sed 's/INSERT INTO public\.\([a-z_]*\)/INSERT INTO stg_g6_\1/g' | \</w:t>
+        <w:br/>
+        <w:t xml:space="preserve">    grep '^INSERT INTO stg_g6_\(persona\|paciente\|personal\|...\)' \</w:t>
+        <w:br/>
+        <w:t xml:space="preserve">    &gt; g6v2_inserts_staging.sql</w:t>
+        <w:br/>
+        <w:br/>
+        <w:t># 3. Ejecutar inserts en staging</w:t>
+        <w:br/>
+        <w:t>docker compose exec -T db psql -U clinica_user -d clinica_db \</w:t>
+        <w:br/>
+        <w:t xml:space="preserve">    -f /tmp/g6v2_inserts_staging.sql</w:t>
+      </w:r>
+    </w:p>
+    <w:p>
+      <w:pPr>
+        <w:pStyle w:val="Heading2"/>
+      </w:pPr>
+      <w:r>
+        <w:t>1.3. Definición del esquema (SQL)</w:t>
       </w:r>
     </w:p>
     <w:p>
@@ -619,7 +963,7 @@
         <w:pStyle w:val="Heading2"/>
       </w:pPr>
       <w:r>
-        <w:t>1.3. dim_sucursal</w:t>
+        <w:t>1.4. dim_sucursal</w:t>
       </w:r>
     </w:p>
     <w:tbl>
@@ -816,7 +1160,7 @@
         <w:pStyle w:val="Heading2"/>
       </w:pPr>
       <w:r>
-        <w:t>1.4. Datos base: Solo Grupo 3</w:t>
+        <w:t>1.5. Datos base: Solo Grupo 3</w:t>
       </w:r>
     </w:p>
     <w:p>
@@ -6798,6 +7142,44 @@
         <w:t>JOIN dim_paciente dp ON dp.ci = sf.paciente_ci</w:t>
         <w:br/>
         <w:t>JOIN dim_medico dm ON dm.ci = sf.medico_ci;</w:t>
+      </w:r>
+    </w:p>
+    <w:p>
+      <w:r>
+        <w:br w:type="page"/>
+      </w:r>
+    </w:p>
+    <w:p>
+      <w:pPr>
+        <w:pStyle w:val="Heading1"/>
+      </w:pPr>
+      <w:r>
+        <w:t>5. CONCLUSIONES</w:t>
+      </w:r>
+    </w:p>
+    <w:p>
+      <w:r>
+        <w:t>Se implementó un Data Warehouse con modelo estrella (snowflake parcial por dim_sucursal) que consolida datos de tres fuentes heterogéneas en un esquema analítico unificado.</w:t>
+      </w:r>
+    </w:p>
+    <w:p>
+      <w:r>
+        <w:t>El modelo consta de una tabla de hechos (fact_atenciones con 123,257 registros) y tres dimensiones: dim_paciente (126,487), dim_medico (14,668) y dim_sucursal (3). La dimensión sucursal permite segmentar y comparar métricas entre las fuentes de origen.</w:t>
+      </w:r>
+    </w:p>
+    <w:p>
+      <w:r>
+        <w:t>Cada fuente presentó desafíos distintos de integración: el Grupo 1 requirió mapeo de códigos CIE-10 a categorías diagnósticas y generación de identificadores sintéticos; el Grupo 6 necesitó conversión de encoding (WIN1252 → UTF-8) y remapeo de 24 especialidades a las 15 del esquema destino. En ambos casos se utilizaron offsets de IDs para evitar colisiones y scripts de rollback para garantizar la reversibilidad de cada carga.</w:t>
+      </w:r>
+    </w:p>
+    <w:p>
+      <w:r>
+        <w:t>Los tres tipos de conexión utilizados (directa local, descarga CSV desde servidor remoto y carga de backup SQL) demuestran la capacidad del proceso ETL para integrar fuentes con distintos mecanismos de acceso.</w:t>
+      </w:r>
+    </w:p>
+    <w:p>
+      <w:r>
+        <w:t>El DW resultante soporta consultas analíticas sobre especialidades, distribución temporal de atenciones, diagnósticos más frecuentes y comparativas entre sucursales, cumpliendo el objetivo de inteligencia de negocios planteado.</w:t>
       </w:r>
     </w:p>
     <w:sectPr>

</xml_diff>